<commit_message>
fix file Tong hop
</commit_message>
<xml_diff>
--- a/assets/docs/tong-hop-y-kien/CD-tong-hop-y-kien-tro.docx
+++ b/assets/docs/tong-hop-y-kien/CD-tong-hop-y-kien-tro.docx
@@ -5,14 +5,14 @@
     <w:tbl>
       <w:tblPr>
         <w:tblStyle w:val="a"/>
-        <w:tblW w:w="10773" w:type="dxa"/>
+        <w:tblW w:w="10914" w:type="dxa"/>
         <w:jc w:val="center"/>
         <w:tblLayout w:type="fixed"/>
         <w:tblLook w:val="0000" w:firstRow="0" w:lastRow="0" w:firstColumn="0" w:lastColumn="0" w:noHBand="0" w:noVBand="0"/>
       </w:tblPr>
       <w:tblGrid>
         <w:gridCol w:w="5812"/>
-        <w:gridCol w:w="4961"/>
+        <w:gridCol w:w="5102"/>
       </w:tblGrid>
       <w:tr>
         <w:trPr>
@@ -97,7 +97,7 @@
         </w:tc>
         <w:tc>
           <w:tcPr>
-            <w:tcW w:w="4961" w:type="dxa"/>
+            <w:tcW w:w="5102" w:type="dxa"/>
             <w:tcBorders>
               <w:top w:val="nil"/>
               <w:left w:val="nil"/>
@@ -174,27 +174,7 @@
                 <w:sz w:val="27"/>
                 <w:szCs w:val="27"/>
               </w:rPr>
-              <w:t xml:space="preserve">{ </w:t>
-            </w:r>
-            <w:r>
-              <w:rPr>
-                <w:rFonts w:ascii="Times New Roman" w:eastAsia="Times New Roman" w:hAnsi="Times New Roman" w:cs="Times New Roman"/>
-                <w:i/>
-                <w:spacing w:val="-8"/>
-                <w:sz w:val="27"/>
-                <w:szCs w:val="27"/>
-              </w:rPr>
-              <w:t>TH</w:t>
-            </w:r>
-            <w:r>
-              <w:rPr>
-                <w:rFonts w:ascii="Times New Roman" w:eastAsia="Times New Roman" w:hAnsi="Times New Roman" w:cs="Times New Roman"/>
-                <w:i/>
-                <w:spacing w:val="-8"/>
-                <w:sz w:val="27"/>
-                <w:szCs w:val="27"/>
-              </w:rPr>
-              <w:t>_NGAY}</w:t>
+              <w:t>{TH_NGAY}</w:t>
             </w:r>
             <w:r>
               <w:rPr>
@@ -224,47 +204,7 @@
                 <w:sz w:val="27"/>
                 <w:szCs w:val="27"/>
               </w:rPr>
-              <w:t>{</w:t>
-            </w:r>
-            <w:r>
-              <w:rPr>
-                <w:rFonts w:ascii="Times New Roman" w:eastAsia="Times New Roman" w:hAnsi="Times New Roman" w:cs="Times New Roman"/>
-                <w:i/>
-                <w:spacing w:val="-8"/>
-                <w:sz w:val="27"/>
-                <w:szCs w:val="27"/>
-              </w:rPr>
-              <w:t>TH</w:t>
-            </w:r>
-            <w:r>
-              <w:rPr>
-                <w:rFonts w:ascii="Times New Roman" w:eastAsia="Times New Roman" w:hAnsi="Times New Roman" w:cs="Times New Roman"/>
-                <w:i/>
-                <w:spacing w:val="-8"/>
-                <w:sz w:val="27"/>
-                <w:szCs w:val="27"/>
-              </w:rPr>
-              <w:t>_</w:t>
-            </w:r>
-            <w:r>
-              <w:rPr>
-                <w:rFonts w:ascii="Times New Roman" w:eastAsia="Times New Roman" w:hAnsi="Times New Roman" w:cs="Times New Roman"/>
-                <w:i/>
-                <w:spacing w:val="-8"/>
-                <w:sz w:val="27"/>
-                <w:szCs w:val="27"/>
-              </w:rPr>
-              <w:t>THANG</w:t>
-            </w:r>
-            <w:r>
-              <w:rPr>
-                <w:rFonts w:ascii="Times New Roman" w:eastAsia="Times New Roman" w:hAnsi="Times New Roman" w:cs="Times New Roman"/>
-                <w:i/>
-                <w:spacing w:val="-8"/>
-                <w:sz w:val="27"/>
-                <w:szCs w:val="27"/>
-              </w:rPr>
-              <w:t>}</w:t>
+              <w:t>{TH_THANG}</w:t>
             </w:r>
             <w:r>
               <w:rPr>
@@ -284,47 +224,7 @@
                 <w:sz w:val="27"/>
                 <w:szCs w:val="27"/>
               </w:rPr>
-              <w:t>{</w:t>
-            </w:r>
-            <w:r>
-              <w:rPr>
-                <w:rFonts w:ascii="Times New Roman" w:eastAsia="Times New Roman" w:hAnsi="Times New Roman" w:cs="Times New Roman"/>
-                <w:i/>
-                <w:spacing w:val="-8"/>
-                <w:sz w:val="27"/>
-                <w:szCs w:val="27"/>
-              </w:rPr>
-              <w:t>TH</w:t>
-            </w:r>
-            <w:r>
-              <w:rPr>
-                <w:rFonts w:ascii="Times New Roman" w:eastAsia="Times New Roman" w:hAnsi="Times New Roman" w:cs="Times New Roman"/>
-                <w:i/>
-                <w:spacing w:val="-8"/>
-                <w:sz w:val="27"/>
-                <w:szCs w:val="27"/>
-              </w:rPr>
-              <w:t>_</w:t>
-            </w:r>
-            <w:r>
-              <w:rPr>
-                <w:rFonts w:ascii="Times New Roman" w:eastAsia="Times New Roman" w:hAnsi="Times New Roman" w:cs="Times New Roman"/>
-                <w:i/>
-                <w:spacing w:val="-8"/>
-                <w:sz w:val="27"/>
-                <w:szCs w:val="27"/>
-              </w:rPr>
-              <w:t>NAM</w:t>
-            </w:r>
-            <w:r>
-              <w:rPr>
-                <w:rFonts w:ascii="Times New Roman" w:eastAsia="Times New Roman" w:hAnsi="Times New Roman" w:cs="Times New Roman"/>
-                <w:i/>
-                <w:spacing w:val="-8"/>
-                <w:sz w:val="27"/>
-                <w:szCs w:val="27"/>
-              </w:rPr>
-              <w:t>}</w:t>
+              <w:t>{TH_NAM}</w:t>
             </w:r>
           </w:p>
         </w:tc>
@@ -511,23 +411,7 @@
           <w:sz w:val="28"/>
           <w:szCs w:val="28"/>
         </w:rPr>
-        <w:t>{</w:t>
-      </w:r>
-      <w:r>
-        <w:rPr>
-          <w:rFonts w:ascii="Times New Roman" w:eastAsia="Times New Roman" w:hAnsi="Times New Roman" w:cs="Times New Roman"/>
-          <w:sz w:val="28"/>
-          <w:szCs w:val="28"/>
-        </w:rPr>
-        <w:t>CD_SL</w:t>
-      </w:r>
-      <w:r>
-        <w:rPr>
-          <w:rFonts w:ascii="Times New Roman" w:eastAsia="Times New Roman" w:hAnsi="Times New Roman" w:cs="Times New Roman"/>
-          <w:sz w:val="28"/>
-          <w:szCs w:val="28"/>
-        </w:rPr>
-        <w:t>}</w:t>
+        <w:t>{CD_SL}</w:t>
       </w:r>
       <w:r>
         <w:rPr>
@@ -561,23 +445,7 @@
           <w:sz w:val="28"/>
           <w:szCs w:val="28"/>
         </w:rPr>
-        <w:t>{</w:t>
-      </w:r>
-      <w:r>
-        <w:rPr>
-          <w:rFonts w:ascii="Times New Roman" w:eastAsia="Times New Roman" w:hAnsi="Times New Roman" w:cs="Times New Roman"/>
-          <w:sz w:val="28"/>
-          <w:szCs w:val="28"/>
-        </w:rPr>
-        <w:t>DK_TEN</w:t>
-      </w:r>
-      <w:r>
-        <w:rPr>
-          <w:rFonts w:ascii="Times New Roman" w:eastAsia="Times New Roman" w:hAnsi="Times New Roman" w:cs="Times New Roman"/>
-          <w:sz w:val="28"/>
-          <w:szCs w:val="28"/>
-        </w:rPr>
-        <w:t>}</w:t>
+        <w:t>{DK_TEN}</w:t>
       </w:r>
       <w:r>
         <w:rPr>
@@ -601,23 +469,7 @@
           <w:sz w:val="28"/>
           <w:szCs w:val="28"/>
         </w:rPr>
-        <w:t>{</w:t>
-      </w:r>
-      <w:r>
-        <w:rPr>
-          <w:rFonts w:ascii="Times New Roman" w:eastAsia="Times New Roman" w:hAnsi="Times New Roman" w:cs="Times New Roman"/>
-          <w:sz w:val="28"/>
-          <w:szCs w:val="28"/>
-        </w:rPr>
-        <w:t>DK_SL</w:t>
-      </w:r>
-      <w:r>
-        <w:rPr>
-          <w:rFonts w:ascii="Times New Roman" w:eastAsia="Times New Roman" w:hAnsi="Times New Roman" w:cs="Times New Roman"/>
-          <w:sz w:val="28"/>
-          <w:szCs w:val="28"/>
-        </w:rPr>
-        <w:t>}</w:t>
+        <w:t>{DK_SL}</w:t>
       </w:r>
       <w:r>
         <w:rPr>
@@ -709,23 +561,7 @@
           <w:sz w:val="28"/>
           <w:szCs w:val="28"/>
         </w:rPr>
-        <w:t>{</w:t>
-      </w:r>
-      <w:r>
-        <w:rPr>
-          <w:rFonts w:ascii="Times New Roman" w:eastAsia="Times New Roman" w:hAnsi="Times New Roman" w:cs="Times New Roman"/>
-          <w:sz w:val="28"/>
-          <w:szCs w:val="28"/>
-        </w:rPr>
-        <w:t>CT_TEN</w:t>
-      </w:r>
-      <w:r>
-        <w:rPr>
-          <w:rFonts w:ascii="Times New Roman" w:eastAsia="Times New Roman" w:hAnsi="Times New Roman" w:cs="Times New Roman"/>
-          <w:sz w:val="28"/>
-          <w:szCs w:val="28"/>
-        </w:rPr>
-        <w:t>}</w:t>
+        <w:t>{CT_TEN}</w:t>
       </w:r>
       <w:r>
         <w:rPr>
@@ -741,6 +577,14 @@
           <w:sz w:val="28"/>
           <w:szCs w:val="28"/>
         </w:rPr>
+        <w:t xml:space="preserve"> {CT_DC}</w:t>
+      </w:r>
+      <w:r>
+        <w:rPr>
+          <w:rFonts w:ascii="Times New Roman" w:eastAsia="Times New Roman" w:hAnsi="Times New Roman" w:cs="Times New Roman"/>
+          <w:sz w:val="28"/>
+          <w:szCs w:val="28"/>
+        </w:rPr>
         <w:t xml:space="preserve"> </w:t>
       </w:r>
       <w:r>
@@ -749,38 +593,6 @@
           <w:sz w:val="28"/>
           <w:szCs w:val="28"/>
         </w:rPr>
-        <w:t>{</w:t>
-      </w:r>
-      <w:r>
-        <w:rPr>
-          <w:rFonts w:ascii="Times New Roman" w:eastAsia="Times New Roman" w:hAnsi="Times New Roman" w:cs="Times New Roman"/>
-          <w:sz w:val="28"/>
-          <w:szCs w:val="28"/>
-        </w:rPr>
-        <w:t>CT_DC</w:t>
-      </w:r>
-      <w:r>
-        <w:rPr>
-          <w:rFonts w:ascii="Times New Roman" w:eastAsia="Times New Roman" w:hAnsi="Times New Roman" w:cs="Times New Roman"/>
-          <w:sz w:val="28"/>
-          <w:szCs w:val="28"/>
-        </w:rPr>
-        <w:t>}</w:t>
-      </w:r>
-      <w:r>
-        <w:rPr>
-          <w:rFonts w:ascii="Times New Roman" w:eastAsia="Times New Roman" w:hAnsi="Times New Roman" w:cs="Times New Roman"/>
-          <w:sz w:val="28"/>
-          <w:szCs w:val="28"/>
-        </w:rPr>
-        <w:t xml:space="preserve"> </w:t>
-      </w:r>
-      <w:r>
-        <w:rPr>
-          <w:rFonts w:ascii="Times New Roman" w:eastAsia="Times New Roman" w:hAnsi="Times New Roman" w:cs="Times New Roman"/>
-          <w:sz w:val="28"/>
-          <w:szCs w:val="28"/>
-        </w:rPr>
         <w:t xml:space="preserve">có </w:t>
       </w:r>
       <w:r>
@@ -789,23 +601,7 @@
           <w:sz w:val="28"/>
           <w:szCs w:val="28"/>
         </w:rPr>
-        <w:t>{</w:t>
-      </w:r>
-      <w:r>
-        <w:rPr>
-          <w:rFonts w:ascii="Times New Roman" w:eastAsia="Times New Roman" w:hAnsi="Times New Roman" w:cs="Times New Roman"/>
-          <w:sz w:val="28"/>
-          <w:szCs w:val="28"/>
-        </w:rPr>
-        <w:t>CT_SL</w:t>
-      </w:r>
-      <w:r>
-        <w:rPr>
-          <w:rFonts w:ascii="Times New Roman" w:eastAsia="Times New Roman" w:hAnsi="Times New Roman" w:cs="Times New Roman"/>
-          <w:sz w:val="28"/>
-          <w:szCs w:val="28"/>
-        </w:rPr>
-        <w:t>}</w:t>
+        <w:t>{CT_SL}</w:t>
       </w:r>
       <w:r>
         <w:rPr>
@@ -948,23 +744,7 @@
           <w:sz w:val="28"/>
           <w:szCs w:val="28"/>
         </w:rPr>
-        <w:t>{</w:t>
-      </w:r>
-      <w:r>
-        <w:rPr>
-          <w:rFonts w:ascii="Times New Roman" w:eastAsia="Times New Roman" w:hAnsi="Times New Roman" w:cs="Times New Roman"/>
-          <w:sz w:val="28"/>
-          <w:szCs w:val="28"/>
-        </w:rPr>
-        <w:t>NAM_HOC</w:t>
-      </w:r>
-      <w:r>
-        <w:rPr>
-          <w:rFonts w:ascii="Times New Roman" w:eastAsia="Times New Roman" w:hAnsi="Times New Roman" w:cs="Times New Roman"/>
-          <w:sz w:val="28"/>
-          <w:szCs w:val="28"/>
-        </w:rPr>
-        <w:t>}</w:t>
+        <w:t>{NAM_HOC}</w:t>
       </w:r>
       <w:r>
         <w:rPr>
@@ -982,27 +762,7 @@
           <w:sz w:val="28"/>
           <w:szCs w:val="28"/>
         </w:rPr>
-        <w:t>{</w:t>
-      </w:r>
-      <w:r>
-        <w:rPr>
-          <w:rFonts w:ascii="Times New Roman" w:eastAsia="Times New Roman" w:hAnsi="Times New Roman" w:cs="Times New Roman"/>
-          <w:b/>
-          <w:bCs/>
-          <w:sz w:val="28"/>
-          <w:szCs w:val="28"/>
-        </w:rPr>
-        <w:t>KQHT</w:t>
-      </w:r>
-      <w:r>
-        <w:rPr>
-          <w:rFonts w:ascii="Times New Roman" w:eastAsia="Times New Roman" w:hAnsi="Times New Roman" w:cs="Times New Roman"/>
-          <w:b/>
-          <w:bCs/>
-          <w:sz w:val="28"/>
-          <w:szCs w:val="28"/>
-        </w:rPr>
-        <w:t>}</w:t>
+        <w:t>{KQHT}</w:t>
       </w:r>
       <w:r>
         <w:rPr>
@@ -1180,7 +940,103 @@
           <w:sz w:val="28"/>
           <w:szCs w:val="28"/>
         </w:rPr>
-        <w:t>{DANG_VIEN}</w:t>
+        <w:t xml:space="preserve">{DANG_VIEN} </w:t>
+      </w:r>
+      <w:r>
+        <w:rPr>
+          <w:rFonts w:ascii="Times New Roman" w:eastAsia="Times New Roman" w:hAnsi="Times New Roman" w:cs="Times New Roman"/>
+          <w:sz w:val="28"/>
+          <w:szCs w:val="28"/>
+        </w:rPr>
+        <w:t xml:space="preserve">trở thành đảng viên chính thức là </w:t>
+      </w:r>
+      <w:r>
+        <w:rPr>
+          <w:rFonts w:ascii="Times New Roman" w:eastAsia="Times New Roman" w:hAnsi="Times New Roman" w:cs="Times New Roman"/>
+          <w:b/>
+          <w:bCs/>
+          <w:sz w:val="28"/>
+          <w:szCs w:val="28"/>
+        </w:rPr>
+        <w:t>{</w:t>
+      </w:r>
+      <w:r>
+        <w:rPr>
+          <w:rFonts w:ascii="Times New Roman" w:eastAsia="Times New Roman" w:hAnsi="Times New Roman" w:cs="Times New Roman"/>
+          <w:b/>
+          <w:bCs/>
+          <w:sz w:val="28"/>
+          <w:szCs w:val="28"/>
+        </w:rPr>
+        <w:t>SH</w:t>
+      </w:r>
+      <w:r>
+        <w:rPr>
+          <w:rFonts w:ascii="Times New Roman" w:eastAsia="Times New Roman" w:hAnsi="Times New Roman" w:cs="Times New Roman"/>
+          <w:b/>
+          <w:bCs/>
+          <w:sz w:val="28"/>
+          <w:szCs w:val="28"/>
+        </w:rPr>
+        <w:t>_SL}</w:t>
+      </w:r>
+      <w:r>
+        <w:rPr>
+          <w:rFonts w:ascii="Times New Roman" w:eastAsia="Times New Roman" w:hAnsi="Times New Roman" w:cs="Times New Roman"/>
+          <w:sz w:val="28"/>
+          <w:szCs w:val="28"/>
+        </w:rPr>
+        <w:t xml:space="preserve"> đồng chí, trong tổng số </w:t>
+      </w:r>
+      <w:r>
+        <w:rPr>
+          <w:rFonts w:ascii="Times New Roman" w:eastAsia="Times New Roman" w:hAnsi="Times New Roman" w:cs="Times New Roman"/>
+          <w:b/>
+          <w:bCs/>
+          <w:sz w:val="28"/>
+          <w:szCs w:val="28"/>
+        </w:rPr>
+        <w:t>{</w:t>
+      </w:r>
+      <w:r>
+        <w:rPr>
+          <w:rFonts w:ascii="Times New Roman" w:eastAsia="Times New Roman" w:hAnsi="Times New Roman" w:cs="Times New Roman"/>
+          <w:b/>
+          <w:bCs/>
+          <w:sz w:val="28"/>
+          <w:szCs w:val="28"/>
+        </w:rPr>
+        <w:t>SH</w:t>
+      </w:r>
+      <w:r>
+        <w:rPr>
+          <w:rFonts w:ascii="Times New Roman" w:eastAsia="Times New Roman" w:hAnsi="Times New Roman" w:cs="Times New Roman"/>
+          <w:b/>
+          <w:bCs/>
+          <w:sz w:val="28"/>
+          <w:szCs w:val="28"/>
+        </w:rPr>
+        <w:t>_SL</w:t>
+      </w:r>
+      <w:r>
+        <w:rPr>
+          <w:rFonts w:ascii="Times New Roman" w:eastAsia="Times New Roman" w:hAnsi="Times New Roman" w:cs="Times New Roman"/>
+          <w:b/>
+          <w:bCs/>
+          <w:sz w:val="28"/>
+          <w:szCs w:val="28"/>
+        </w:rPr>
+        <w:t>_TT</w:t>
+      </w:r>
+      <w:r>
+        <w:rPr>
+          <w:rFonts w:ascii="Times New Roman" w:eastAsia="Times New Roman" w:hAnsi="Times New Roman" w:cs="Times New Roman"/>
+          <w:b/>
+          <w:bCs/>
+          <w:sz w:val="28"/>
+          <w:szCs w:val="28"/>
+        </w:rPr>
+        <w:t>}</w:t>
       </w:r>
       <w:r>
         <w:rPr>
@@ -1198,13 +1054,11 @@
           <w:sz w:val="28"/>
           <w:szCs w:val="28"/>
         </w:rPr>
-        <w:t xml:space="preserve">trở thành đảng viên chính thức là </w:t>
-      </w:r>
-      <w:r>
-        <w:rPr>
-          <w:rFonts w:ascii="Times New Roman" w:eastAsia="Times New Roman" w:hAnsi="Times New Roman" w:cs="Times New Roman"/>
-          <w:b/>
-          <w:bCs/>
+        <w:t xml:space="preserve">đồng chí được hỏi ý kiến (đạt </w:t>
+      </w:r>
+      <w:r>
+        <w:rPr>
+          <w:rFonts w:ascii="Times New Roman" w:eastAsia="Times New Roman" w:hAnsi="Times New Roman" w:cs="Times New Roman"/>
           <w:sz w:val="28"/>
           <w:szCs w:val="28"/>
         </w:rPr>
@@ -1213,8 +1067,6 @@
       <w:r>
         <w:rPr>
           <w:rFonts w:ascii="Times New Roman" w:eastAsia="Times New Roman" w:hAnsi="Times New Roman" w:cs="Times New Roman"/>
-          <w:b/>
-          <w:bCs/>
           <w:sz w:val="28"/>
           <w:szCs w:val="28"/>
         </w:rPr>
@@ -1223,20 +1075,34 @@
       <w:r>
         <w:rPr>
           <w:rFonts w:ascii="Times New Roman" w:eastAsia="Times New Roman" w:hAnsi="Times New Roman" w:cs="Times New Roman"/>
-          <w:b/>
-          <w:bCs/>
-          <w:sz w:val="28"/>
-          <w:szCs w:val="28"/>
-        </w:rPr>
-        <w:t>_SL}</w:t>
-      </w:r>
-      <w:r>
-        <w:rPr>
-          <w:rFonts w:ascii="Times New Roman" w:eastAsia="Times New Roman" w:hAnsi="Times New Roman" w:cs="Times New Roman"/>
-          <w:sz w:val="28"/>
-          <w:szCs w:val="28"/>
-        </w:rPr>
-        <w:t xml:space="preserve"> đồng chí, trong tổng số </w:t>
+          <w:sz w:val="28"/>
+          <w:szCs w:val="28"/>
+        </w:rPr>
+        <w:t>_</w:t>
+      </w:r>
+      <w:r>
+        <w:rPr>
+          <w:rFonts w:ascii="Times New Roman" w:eastAsia="Times New Roman" w:hAnsi="Times New Roman" w:cs="Times New Roman"/>
+          <w:sz w:val="28"/>
+          <w:szCs w:val="28"/>
+        </w:rPr>
+        <w:t>PT</w:t>
+      </w:r>
+      <w:r>
+        <w:rPr>
+          <w:rFonts w:ascii="Times New Roman" w:eastAsia="Times New Roman" w:hAnsi="Times New Roman" w:cs="Times New Roman"/>
+          <w:sz w:val="28"/>
+          <w:szCs w:val="28"/>
+        </w:rPr>
+        <w:t>_TT}</w:t>
+      </w:r>
+      <w:r>
+        <w:rPr>
+          <w:rFonts w:ascii="Times New Roman" w:eastAsia="Times New Roman" w:hAnsi="Times New Roman" w:cs="Times New Roman"/>
+          <w:sz w:val="28"/>
+          <w:szCs w:val="28"/>
+        </w:rPr>
+        <w:t xml:space="preserve">%). Số không tán thành là </w:t>
       </w:r>
       <w:r>
         <w:rPr>
@@ -1276,143 +1142,7 @@
           <w:sz w:val="28"/>
           <w:szCs w:val="28"/>
         </w:rPr>
-        <w:t>_TT</w:t>
-      </w:r>
-      <w:r>
-        <w:rPr>
-          <w:rFonts w:ascii="Times New Roman" w:eastAsia="Times New Roman" w:hAnsi="Times New Roman" w:cs="Times New Roman"/>
-          <w:b/>
-          <w:bCs/>
-          <w:sz w:val="28"/>
-          <w:szCs w:val="28"/>
-        </w:rPr>
-        <w:t>}</w:t>
-      </w:r>
-      <w:r>
-        <w:rPr>
-          <w:rFonts w:ascii="Times New Roman" w:eastAsia="Times New Roman" w:hAnsi="Times New Roman" w:cs="Times New Roman"/>
-          <w:b/>
-          <w:bCs/>
-          <w:sz w:val="28"/>
-          <w:szCs w:val="28"/>
-        </w:rPr>
-        <w:t xml:space="preserve"> </w:t>
-      </w:r>
-      <w:r>
-        <w:rPr>
-          <w:rFonts w:ascii="Times New Roman" w:eastAsia="Times New Roman" w:hAnsi="Times New Roman" w:cs="Times New Roman"/>
-          <w:sz w:val="28"/>
-          <w:szCs w:val="28"/>
-        </w:rPr>
-        <w:t xml:space="preserve">đồng chí được hỏi ý kiến (đạt </w:t>
-      </w:r>
-      <w:r>
-        <w:rPr>
-          <w:rFonts w:ascii="Times New Roman" w:eastAsia="Times New Roman" w:hAnsi="Times New Roman" w:cs="Times New Roman"/>
-          <w:sz w:val="28"/>
-          <w:szCs w:val="28"/>
-        </w:rPr>
-        <w:t>{</w:t>
-      </w:r>
-      <w:r>
-        <w:rPr>
-          <w:rFonts w:ascii="Times New Roman" w:eastAsia="Times New Roman" w:hAnsi="Times New Roman" w:cs="Times New Roman"/>
-          <w:sz w:val="28"/>
-          <w:szCs w:val="28"/>
-        </w:rPr>
-        <w:t>SH</w:t>
-      </w:r>
-      <w:r>
-        <w:rPr>
-          <w:rFonts w:ascii="Times New Roman" w:eastAsia="Times New Roman" w:hAnsi="Times New Roman" w:cs="Times New Roman"/>
-          <w:sz w:val="28"/>
-          <w:szCs w:val="28"/>
-        </w:rPr>
-        <w:t>_</w:t>
-      </w:r>
-      <w:r>
-        <w:rPr>
-          <w:rFonts w:ascii="Times New Roman" w:eastAsia="Times New Roman" w:hAnsi="Times New Roman" w:cs="Times New Roman"/>
-          <w:sz w:val="28"/>
-          <w:szCs w:val="28"/>
-        </w:rPr>
-        <w:t>PT</w:t>
-      </w:r>
-      <w:r>
-        <w:rPr>
-          <w:rFonts w:ascii="Times New Roman" w:eastAsia="Times New Roman" w:hAnsi="Times New Roman" w:cs="Times New Roman"/>
-          <w:sz w:val="28"/>
-          <w:szCs w:val="28"/>
-        </w:rPr>
-        <w:t>_TT}</w:t>
-      </w:r>
-      <w:r>
-        <w:rPr>
-          <w:rFonts w:ascii="Times New Roman" w:eastAsia="Times New Roman" w:hAnsi="Times New Roman" w:cs="Times New Roman"/>
-          <w:sz w:val="28"/>
-          <w:szCs w:val="28"/>
-        </w:rPr>
-        <w:t xml:space="preserve">%). Số không tán thành là </w:t>
-      </w:r>
-      <w:r>
-        <w:rPr>
-          <w:rFonts w:ascii="Times New Roman" w:eastAsia="Times New Roman" w:hAnsi="Times New Roman" w:cs="Times New Roman"/>
-          <w:b/>
-          <w:bCs/>
-          <w:sz w:val="28"/>
-          <w:szCs w:val="28"/>
-        </w:rPr>
-        <w:t>{</w:t>
-      </w:r>
-      <w:r>
-        <w:rPr>
-          <w:rFonts w:ascii="Times New Roman" w:eastAsia="Times New Roman" w:hAnsi="Times New Roman" w:cs="Times New Roman"/>
-          <w:b/>
-          <w:bCs/>
-          <w:sz w:val="28"/>
-          <w:szCs w:val="28"/>
-        </w:rPr>
-        <w:t>SH</w:t>
-      </w:r>
-      <w:r>
-        <w:rPr>
-          <w:rFonts w:ascii="Times New Roman" w:eastAsia="Times New Roman" w:hAnsi="Times New Roman" w:cs="Times New Roman"/>
-          <w:b/>
-          <w:bCs/>
-          <w:sz w:val="28"/>
-          <w:szCs w:val="28"/>
-        </w:rPr>
-        <w:t>_SL</w:t>
-      </w:r>
-      <w:r>
-        <w:rPr>
-          <w:rFonts w:ascii="Times New Roman" w:eastAsia="Times New Roman" w:hAnsi="Times New Roman" w:cs="Times New Roman"/>
-          <w:b/>
-          <w:bCs/>
-          <w:sz w:val="28"/>
-          <w:szCs w:val="28"/>
-        </w:rPr>
-        <w:t>_</w:t>
-      </w:r>
-      <w:r>
-        <w:rPr>
-          <w:rFonts w:ascii="Times New Roman" w:eastAsia="Times New Roman" w:hAnsi="Times New Roman" w:cs="Times New Roman"/>
-          <w:b/>
-          <w:bCs/>
-          <w:sz w:val="28"/>
-          <w:szCs w:val="28"/>
-        </w:rPr>
-        <w:t>K</w:t>
-      </w:r>
-      <w:r>
-        <w:rPr>
-          <w:rFonts w:ascii="Times New Roman" w:eastAsia="Times New Roman" w:hAnsi="Times New Roman" w:cs="Times New Roman"/>
-          <w:b/>
-          <w:bCs/>
-          <w:sz w:val="28"/>
-          <w:szCs w:val="28"/>
-        </w:rPr>
-        <w:t>TT</w:t>
+        <w:t>_KTT</w:t>
       </w:r>
       <w:r>
         <w:rPr>
@@ -1630,27 +1360,7 @@
           <w:sz w:val="28"/>
           <w:szCs w:val="28"/>
         </w:rPr>
-        <w:t>{CT_SL_</w:t>
-      </w:r>
-      <w:r>
-        <w:rPr>
-          <w:rFonts w:ascii="Times New Roman" w:eastAsia="Times New Roman" w:hAnsi="Times New Roman" w:cs="Times New Roman"/>
-          <w:b/>
-          <w:bCs/>
-          <w:sz w:val="28"/>
-          <w:szCs w:val="28"/>
-        </w:rPr>
-        <w:t>K</w:t>
-      </w:r>
-      <w:r>
-        <w:rPr>
-          <w:rFonts w:ascii="Times New Roman" w:eastAsia="Times New Roman" w:hAnsi="Times New Roman" w:cs="Times New Roman"/>
-          <w:b/>
-          <w:bCs/>
-          <w:sz w:val="28"/>
-          <w:szCs w:val="28"/>
-        </w:rPr>
-        <w:t>TT}</w:t>
+        <w:t>{CT_SL_KTT}</w:t>
       </w:r>
       <w:r>
         <w:rPr>

</xml_diff>